<commit_message>
docs: strip prof name, drop PDF exports, add 'why this project' explainer, tighten stack scope
</commit_message>
<xml_diff>
--- a/exports/LEARNING_GUIDE.docx
+++ b/exports/LEARNING_GUIDE.docx
@@ -50,7 +50,7 @@
           <w:i w:val="0"/>
           <w:sz w:val="22"/>
         </w:rPr>
-        <w:t xml:space="preserve"> Dr. Floriment Klinaku, SRH University Stuttgart </w:t>
+        <w:t xml:space="preserve"> the course supervisor, SRH University Stuttgart </w:t>
       </w:r>
       <w:r>
         <w:rPr>
@@ -111,7 +111,7 @@
           <w:i w:val="0"/>
           <w:sz w:val="22"/>
         </w:rPr>
-        <w:t>This document collects twenty questions the supervisor and panel may ask during the prototype defence, each paired with a prepared answer that an architect should be able to deliver in under ninety seconds. The answers are written for vocal delivery — short sentences, clear logical structure, named artefacts — and are calibrated to the level of detail Dr. Klinaku has expected in week-by-week tutorials.</w:t>
+        <w:t>This document collects twenty questions the supervisor and panel may ask during the prototype defence, each paired with a prepared answer that an architect should be able to deliver in under ninety seconds. The answers are written for vocal delivery — short sentences, clear logical structure, named artefacts — and are calibrated to the level of detail the course supervisor has expected in week-by-week tutorials.</w:t>
       </w:r>
     </w:p>
     <w:p>
@@ -1248,7 +1248,7 @@
           <w:i w:val="0"/>
           <w:sz w:val="22"/>
         </w:rPr>
-        <w:t>A client-server architecture with an event-driven core. Inside each module the code is layered: domain at the bottom, wire and simulation in the middle, transport and rendering at the top. The combination is the most common shape for real-time multiplayer games and is the one Dr. Klinaku recommended in the week-three reference-architecture lecture as the natural fit when the dominant quality drivers are integrity and latency.</w:t>
+        <w:t>A client-server architecture with an event-driven core. Inside each module the code is layered: domain at the bottom, wire and simulation in the middle, transport and rendering at the top. The combination is the most common shape for real-time multiplayer games and is the one the course supervisor recommended in the week-three reference-architecture lecture as the natural fit when the dominant quality drivers are integrity and latency.</w:t>
       </w:r>
     </w:p>
     <w:p>

</xml_diff>